<commit_message>
Add arm_scope/read_scope for event-in-later-step capture; refresh deck + manuals
- arm_scope / read_scope (+ fleet arm / read_armed): non-blocking arm, then read the
  frozen record after the trigger fires - for a signal generated in a LATER TestStand
  step (Tektronix). Avoids capture_scope(single=True) blocking with nothing to capture.
- Presentation: add "Config parameters - what each field expects" slide; update the
  Configure slide to use duration_s (drop removed horizontal_scale / triggerModeAuto).
- User manual + developer guide: add config parameter reference tables (scope, channel,
  generator); document scope_delay; replace stale horizontal_scale with duration_s.
</commit_message>
<xml_diff>
--- a/docs/teststand_bench_api-user-manual.docx
+++ b/docs/teststand_bench_api-user-manual.docx
@@ -2282,172 +2282,835 @@
         <w:pStyle w:val="Heading2"/>
       </w:pPr>
       <w:r>
-        <w:t>5.2 Values are plain numbers in the scope's native units</w:t>
-      </w:r>
-    </w:p>
-    <w:p>
-      <w:r>
-        <w:t>Type the number only - there are no units in the file. The native units are:</w:t>
-      </w:r>
-    </w:p>
-    <w:p>
-      <w:pPr>
-        <w:pStyle w:val="ListBullet"/>
-      </w:pPr>
-      <w:r>
-        <w:t>horizontal_scale - SECONDS per division. This is the one to watch: an STP usually lists ms or s, so convert to seconds. 2 ms/div = 0.002; 2 s/div = 2.0.</w:t>
-      </w:r>
-    </w:p>
-    <w:p>
-      <w:pPr>
-        <w:pStyle w:val="ListBullet"/>
-      </w:pPr>
-      <w:r>
-        <w:t>vertical_scale - volts per division (e.g. 5).</w:t>
-      </w:r>
-    </w:p>
-    <w:p>
-      <w:pPr>
-        <w:pStyle w:val="ListBullet"/>
-      </w:pPr>
-      <w:r>
-        <w:t>vertical_position - divisions (e.g. -3.5).</w:t>
-      </w:r>
-    </w:p>
-    <w:p>
-      <w:pPr>
-        <w:pStyle w:val="ListBullet"/>
-      </w:pPr>
-      <w:r>
-        <w:t>trigger_position - percent of the record before the trigger (e.g. 10).</w:t>
-      </w:r>
-    </w:p>
-    <w:p>
-      <w:pPr>
-        <w:pStyle w:val="ListBullet"/>
-      </w:pPr>
-      <w:r>
-        <w:t>record_length - points (e.g. 10000).</w:t>
-      </w:r>
-    </w:p>
-    <w:p>
-      <w:pPr>
-        <w:pStyle w:val="ListBullet"/>
-      </w:pPr>
-      <w:r>
-        <w:t>trigger_level - volts (e.g. 2.5). OR the word "half_battery" to use half of battery_voltage (for an STP that says 'trigger at half of battery voltage').</w:t>
-      </w:r>
-    </w:p>
-    <w:p>
-      <w:pPr>
-        <w:pStyle w:val="ListBullet"/>
-      </w:pPr>
-      <w:r>
-        <w:t>termination - ohms: 1000000 for 1 MOhm, 50 for 50 Ohm.</w:t>
-      </w:r>
-    </w:p>
-    <w:p>
-      <w:pPr>
-        <w:pStyle w:val="ListBullet"/>
-      </w:pPr>
-      <w:r>
-        <w:t>battery_voltage - volts (e.g. 12 or 24); only used to resolve a "half_battery" trigger level.</w:t>
-      </w:r>
-    </w:p>
+        <w:t>5.2 Parameter reference - what each field expects</w:t>
+      </w:r>
+    </w:p>
+    <w:p>
+      <w:r>
+        <w:t>Type the number only - there are no units in the file (plain numbers in the scope's native units). Leave any field null to leave that setting untouched. Scope-wide fields:</w:t>
+      </w:r>
+    </w:p>
+    <w:tbl>
+      <w:tblPr>
+        <w:tblStyle w:val="TableGrid"/>
+        <w:tblW w:type="auto" w:w="0"/>
+        <w:tblLook w:firstColumn="1" w:firstRow="1" w:lastColumn="0" w:lastRow="0" w:noHBand="0" w:noVBand="1" w:val="04A0"/>
+      </w:tblPr>
+      <w:tblGrid>
+        <w:gridCol w:w="2880"/>
+        <w:gridCol w:w="2880"/>
+        <w:gridCol w:w="2880"/>
+      </w:tblGrid>
+      <w:tr>
+        <w:tc>
+          <w:tcPr>
+            <w:tcW w:type="dxa" w:w="2880"/>
+          </w:tcPr>
+          <w:p>
+            <w:r>
+              <w:rPr>
+                <w:b/>
+              </w:rPr>
+              <w:t>Field</w:t>
+            </w:r>
+          </w:p>
+        </w:tc>
+        <w:tc>
+          <w:tcPr>
+            <w:tcW w:type="dxa" w:w="2880"/>
+          </w:tcPr>
+          <w:p>
+            <w:r>
+              <w:rPr>
+                <w:b/>
+              </w:rPr>
+              <w:t>Expected value</w:t>
+            </w:r>
+          </w:p>
+        </w:tc>
+        <w:tc>
+          <w:tcPr>
+            <w:tcW w:type="dxa" w:w="2880"/>
+          </w:tcPr>
+          <w:p>
+            <w:r>
+              <w:rPr>
+                <w:b/>
+              </w:rPr>
+              <w:t>What it means</w:t>
+            </w:r>
+          </w:p>
+        </w:tc>
+      </w:tr>
+      <w:tr>
+        <w:tc>
+          <w:tcPr>
+            <w:tcW w:type="dxa" w:w="2880"/>
+          </w:tcPr>
+          <w:p>
+            <w:r>
+              <w:rPr>
+                <w:sz w:val="19"/>
+              </w:rPr>
+              <w:t>record_length</w:t>
+            </w:r>
+          </w:p>
+        </w:tc>
+        <w:tc>
+          <w:tcPr>
+            <w:tcW w:type="dxa" w:w="2880"/>
+          </w:tcPr>
+          <w:p>
+            <w:r>
+              <w:rPr>
+                <w:sz w:val="19"/>
+              </w:rPr>
+              <w:t>integer (points)</w:t>
+            </w:r>
+          </w:p>
+        </w:tc>
+        <w:tc>
+          <w:tcPr>
+            <w:tcW w:type="dxa" w:w="2880"/>
+          </w:tcPr>
+          <w:p>
+            <w:r>
+              <w:rPr>
+                <w:sz w:val="19"/>
+              </w:rPr>
+              <w:t>Number of samples in the record, e.g. 10000.</w:t>
+            </w:r>
+          </w:p>
+        </w:tc>
+      </w:tr>
+      <w:tr>
+        <w:tc>
+          <w:tcPr>
+            <w:tcW w:type="dxa" w:w="2880"/>
+          </w:tcPr>
+          <w:p>
+            <w:r>
+              <w:rPr>
+                <w:sz w:val="19"/>
+              </w:rPr>
+              <w:t>trigger_position</w:t>
+            </w:r>
+          </w:p>
+        </w:tc>
+        <w:tc>
+          <w:tcPr>
+            <w:tcW w:type="dxa" w:w="2880"/>
+          </w:tcPr>
+          <w:p>
+            <w:r>
+              <w:rPr>
+                <w:sz w:val="19"/>
+              </w:rPr>
+              <w:t>0-100 (percent)</w:t>
+            </w:r>
+          </w:p>
+        </w:tc>
+        <w:tc>
+          <w:tcPr>
+            <w:tcW w:type="dxa" w:w="2880"/>
+          </w:tcPr>
+          <w:p>
+            <w:r>
+              <w:rPr>
+                <w:sz w:val="19"/>
+              </w:rPr>
+              <w:t>Where the trigger sits across the screen; 10 = 10% from the left (pre-trigger).</w:t>
+            </w:r>
+          </w:p>
+        </w:tc>
+      </w:tr>
+      <w:tr>
+        <w:tc>
+          <w:tcPr>
+            <w:tcW w:type="dxa" w:w="2880"/>
+          </w:tcPr>
+          <w:p>
+            <w:r>
+              <w:rPr>
+                <w:sz w:val="19"/>
+              </w:rPr>
+              <w:t>sample_rate</w:t>
+            </w:r>
+          </w:p>
+        </w:tc>
+        <w:tc>
+          <w:tcPr>
+            <w:tcW w:type="dxa" w:w="2880"/>
+          </w:tcPr>
+          <w:p>
+            <w:r>
+              <w:rPr>
+                <w:sz w:val="19"/>
+              </w:rPr>
+              <w:t>number (S/s) or null</w:t>
+            </w:r>
+          </w:p>
+        </w:tc>
+        <w:tc>
+          <w:tcPr>
+            <w:tcW w:type="dxa" w:w="2880"/>
+          </w:tcPr>
+          <w:p>
+            <w:r>
+              <w:rPr>
+                <w:sz w:val="19"/>
+              </w:rPr>
+              <w:t>Samples per second. Usually null (the scope works it out); set a number only to force a specific rate.</w:t>
+            </w:r>
+          </w:p>
+        </w:tc>
+      </w:tr>
+      <w:tr>
+        <w:tc>
+          <w:tcPr>
+            <w:tcW w:type="dxa" w:w="2880"/>
+          </w:tcPr>
+          <w:p>
+            <w:r>
+              <w:rPr>
+                <w:sz w:val="19"/>
+              </w:rPr>
+              <w:t>trigger_source</w:t>
+            </w:r>
+          </w:p>
+        </w:tc>
+        <w:tc>
+          <w:tcPr>
+            <w:tcW w:type="dxa" w:w="2880"/>
+          </w:tcPr>
+          <w:p>
+            <w:r>
+              <w:rPr>
+                <w:sz w:val="19"/>
+              </w:rPr>
+              <w:t>"CH1" or "CH2"</w:t>
+            </w:r>
+          </w:p>
+        </w:tc>
+        <w:tc>
+          <w:tcPr>
+            <w:tcW w:type="dxa" w:w="2880"/>
+          </w:tcPr>
+          <w:p>
+            <w:r>
+              <w:rPr>
+                <w:sz w:val="19"/>
+              </w:rPr>
+              <w:t>Which channel the trigger watches.</w:t>
+            </w:r>
+          </w:p>
+        </w:tc>
+      </w:tr>
+      <w:tr>
+        <w:tc>
+          <w:tcPr>
+            <w:tcW w:type="dxa" w:w="2880"/>
+          </w:tcPr>
+          <w:p>
+            <w:r>
+              <w:rPr>
+                <w:sz w:val="19"/>
+              </w:rPr>
+              <w:t>trigger_type</w:t>
+            </w:r>
+          </w:p>
+        </w:tc>
+        <w:tc>
+          <w:tcPr>
+            <w:tcW w:type="dxa" w:w="2880"/>
+          </w:tcPr>
+          <w:p>
+            <w:r>
+              <w:rPr>
+                <w:sz w:val="19"/>
+              </w:rPr>
+              <w:t>"EDGE"</w:t>
+            </w:r>
+          </w:p>
+        </w:tc>
+        <w:tc>
+          <w:tcPr>
+            <w:tcW w:type="dxa" w:w="2880"/>
+          </w:tcPr>
+          <w:p>
+            <w:r>
+              <w:rPr>
+                <w:sz w:val="19"/>
+              </w:rPr>
+              <w:t>Trigger type (only EDGE is supported).</w:t>
+            </w:r>
+          </w:p>
+        </w:tc>
+      </w:tr>
+      <w:tr>
+        <w:tc>
+          <w:tcPr>
+            <w:tcW w:type="dxa" w:w="2880"/>
+          </w:tcPr>
+          <w:p>
+            <w:r>
+              <w:rPr>
+                <w:sz w:val="19"/>
+              </w:rPr>
+              <w:t>trigger_slope</w:t>
+            </w:r>
+          </w:p>
+        </w:tc>
+        <w:tc>
+          <w:tcPr>
+            <w:tcW w:type="dxa" w:w="2880"/>
+          </w:tcPr>
+          <w:p>
+            <w:r>
+              <w:rPr>
+                <w:sz w:val="19"/>
+              </w:rPr>
+              <w:t>"RISE" or "FALL"</w:t>
+            </w:r>
+          </w:p>
+        </w:tc>
+        <w:tc>
+          <w:tcPr>
+            <w:tcW w:type="dxa" w:w="2880"/>
+          </w:tcPr>
+          <w:p>
+            <w:r>
+              <w:rPr>
+                <w:sz w:val="19"/>
+              </w:rPr>
+              <w:t>Which edge fires the trigger.</w:t>
+            </w:r>
+          </w:p>
+        </w:tc>
+      </w:tr>
+      <w:tr>
+        <w:tc>
+          <w:tcPr>
+            <w:tcW w:type="dxa" w:w="2880"/>
+          </w:tcPr>
+          <w:p>
+            <w:r>
+              <w:rPr>
+                <w:sz w:val="19"/>
+              </w:rPr>
+              <w:t>trigger_level</w:t>
+            </w:r>
+          </w:p>
+        </w:tc>
+        <w:tc>
+          <w:tcPr>
+            <w:tcW w:type="dxa" w:w="2880"/>
+          </w:tcPr>
+          <w:p>
+            <w:r>
+              <w:rPr>
+                <w:sz w:val="19"/>
+              </w:rPr>
+              <w:t>volts, or "half_battery"</w:t>
+            </w:r>
+          </w:p>
+        </w:tc>
+        <w:tc>
+          <w:tcPr>
+            <w:tcW w:type="dxa" w:w="2880"/>
+          </w:tcPr>
+          <w:p>
+            <w:r>
+              <w:rPr>
+                <w:sz w:val="19"/>
+              </w:rPr>
+              <w:t>Voltage the signal must cross to trigger. "half_battery" = battery_voltage / 2.</w:t>
+            </w:r>
+          </w:p>
+        </w:tc>
+      </w:tr>
+      <w:tr>
+        <w:tc>
+          <w:tcPr>
+            <w:tcW w:type="dxa" w:w="2880"/>
+          </w:tcPr>
+          <w:p>
+            <w:r>
+              <w:rPr>
+                <w:sz w:val="19"/>
+              </w:rPr>
+              <w:t>trigger_mode</w:t>
+            </w:r>
+          </w:p>
+        </w:tc>
+        <w:tc>
+          <w:tcPr>
+            <w:tcW w:type="dxa" w:w="2880"/>
+          </w:tcPr>
+          <w:p>
+            <w:r>
+              <w:rPr>
+                <w:sz w:val="19"/>
+              </w:rPr>
+              <w:t>"AUTO" or "NORMal"</w:t>
+            </w:r>
+          </w:p>
+        </w:tc>
+        <w:tc>
+          <w:tcPr>
+            <w:tcW w:type="dxa" w:w="2880"/>
+          </w:tcPr>
+          <w:p>
+            <w:r>
+              <w:rPr>
+                <w:sz w:val="19"/>
+              </w:rPr>
+              <w:t>AUTO free-runs (self-triggers); NORMal waits for the real trigger - use it for a one-time event.</w:t>
+            </w:r>
+          </w:p>
+        </w:tc>
+      </w:tr>
+      <w:tr>
+        <w:tc>
+          <w:tcPr>
+            <w:tcW w:type="dxa" w:w="2880"/>
+          </w:tcPr>
+          <w:p>
+            <w:r>
+              <w:rPr>
+                <w:sz w:val="19"/>
+              </w:rPr>
+              <w:t>battery_voltage</w:t>
+            </w:r>
+          </w:p>
+        </w:tc>
+        <w:tc>
+          <w:tcPr>
+            <w:tcW w:type="dxa" w:w="2880"/>
+          </w:tcPr>
+          <w:p>
+            <w:r>
+              <w:rPr>
+                <w:sz w:val="19"/>
+              </w:rPr>
+              <w:t>volts, or null</w:t>
+            </w:r>
+          </w:p>
+        </w:tc>
+        <w:tc>
+          <w:tcPr>
+            <w:tcW w:type="dxa" w:w="2880"/>
+          </w:tcPr>
+          <w:p>
+            <w:r>
+              <w:rPr>
+                <w:sz w:val="19"/>
+              </w:rPr>
+              <w:t>Only used to resolve a "half_battery" trigger level (e.g. 12 or 24).</w:t>
+            </w:r>
+          </w:p>
+        </w:tc>
+      </w:tr>
+      <w:tr>
+        <w:tc>
+          <w:tcPr>
+            <w:tcW w:type="dxa" w:w="2880"/>
+          </w:tcPr>
+          <w:p>
+            <w:r>
+              <w:rPr>
+                <w:sz w:val="19"/>
+              </w:rPr>
+              <w:t>acquire_mode</w:t>
+            </w:r>
+          </w:p>
+        </w:tc>
+        <w:tc>
+          <w:tcPr>
+            <w:tcW w:type="dxa" w:w="2880"/>
+          </w:tcPr>
+          <w:p>
+            <w:r>
+              <w:rPr>
+                <w:sz w:val="19"/>
+              </w:rPr>
+              <w:t>"SAMple"</w:t>
+            </w:r>
+          </w:p>
+        </w:tc>
+        <w:tc>
+          <w:tcPr>
+            <w:tcW w:type="dxa" w:w="2880"/>
+          </w:tcPr>
+          <w:p>
+            <w:r>
+              <w:rPr>
+                <w:sz w:val="19"/>
+              </w:rPr>
+              <w:t>Acquisition mode. "SAMple" for these tests; "HIRes" for a cleaner slow/noisy trace.</w:t>
+            </w:r>
+          </w:p>
+        </w:tc>
+      </w:tr>
+      <w:tr>
+        <w:tc>
+          <w:tcPr>
+            <w:tcW w:type="dxa" w:w="2880"/>
+          </w:tcPr>
+          <w:p>
+            <w:r>
+              <w:rPr>
+                <w:sz w:val="19"/>
+              </w:rPr>
+              <w:t>measurement</w:t>
+            </w:r>
+          </w:p>
+        </w:tc>
+        <w:tc>
+          <w:tcPr>
+            <w:tcW w:type="dxa" w:w="2880"/>
+          </w:tcPr>
+          <w:p>
+            <w:r>
+              <w:rPr>
+                <w:sz w:val="19"/>
+              </w:rPr>
+              <w:t>"rms"/"delay"/... or null</w:t>
+            </w:r>
+          </w:p>
+        </w:tc>
+        <w:tc>
+          <w:tcPr>
+            <w:tcW w:type="dxa" w:w="2880"/>
+          </w:tcPr>
+          <w:p>
+            <w:r>
+              <w:rPr>
+                <w:sz w:val="19"/>
+              </w:rPr>
+              <w:t>A note of what the test records. Metadata for your reference; it does not change the scope.</w:t>
+            </w:r>
+          </w:p>
+        </w:tc>
+      </w:tr>
+    </w:tbl>
+    <w:p/>
+    <w:p>
+      <w:r>
+        <w:t>Per-channel fields, under channels."1" and channels."2":</w:t>
+      </w:r>
+    </w:p>
+    <w:tbl>
+      <w:tblPr>
+        <w:tblStyle w:val="TableGrid"/>
+        <w:tblW w:type="auto" w:w="0"/>
+        <w:tblLook w:firstColumn="1" w:firstRow="1" w:lastColumn="0" w:lastRow="0" w:noHBand="0" w:noVBand="1" w:val="04A0"/>
+      </w:tblPr>
+      <w:tblGrid>
+        <w:gridCol w:w="2880"/>
+        <w:gridCol w:w="2880"/>
+        <w:gridCol w:w="2880"/>
+      </w:tblGrid>
+      <w:tr>
+        <w:tc>
+          <w:tcPr>
+            <w:tcW w:type="dxa" w:w="2880"/>
+          </w:tcPr>
+          <w:p>
+            <w:r>
+              <w:rPr>
+                <w:b/>
+              </w:rPr>
+              <w:t>Field</w:t>
+            </w:r>
+          </w:p>
+        </w:tc>
+        <w:tc>
+          <w:tcPr>
+            <w:tcW w:type="dxa" w:w="2880"/>
+          </w:tcPr>
+          <w:p>
+            <w:r>
+              <w:rPr>
+                <w:b/>
+              </w:rPr>
+              <w:t>Expected value</w:t>
+            </w:r>
+          </w:p>
+        </w:tc>
+        <w:tc>
+          <w:tcPr>
+            <w:tcW w:type="dxa" w:w="2880"/>
+          </w:tcPr>
+          <w:p>
+            <w:r>
+              <w:rPr>
+                <w:b/>
+              </w:rPr>
+              <w:t>What it means</w:t>
+            </w:r>
+          </w:p>
+        </w:tc>
+      </w:tr>
+      <w:tr>
+        <w:tc>
+          <w:tcPr>
+            <w:tcW w:type="dxa" w:w="2880"/>
+          </w:tcPr>
+          <w:p>
+            <w:r>
+              <w:rPr>
+                <w:sz w:val="19"/>
+              </w:rPr>
+              <w:t>input_coupling</w:t>
+            </w:r>
+          </w:p>
+        </w:tc>
+        <w:tc>
+          <w:tcPr>
+            <w:tcW w:type="dxa" w:w="2880"/>
+          </w:tcPr>
+          <w:p>
+            <w:r>
+              <w:rPr>
+                <w:sz w:val="19"/>
+              </w:rPr>
+              <w:t>"DC" or "AC"</w:t>
+            </w:r>
+          </w:p>
+        </w:tc>
+        <w:tc>
+          <w:tcPr>
+            <w:tcW w:type="dxa" w:w="2880"/>
+          </w:tcPr>
+          <w:p>
+            <w:r>
+              <w:rPr>
+                <w:sz w:val="19"/>
+              </w:rPr>
+              <w:t>Input coupling.</w:t>
+            </w:r>
+          </w:p>
+        </w:tc>
+      </w:tr>
+      <w:tr>
+        <w:tc>
+          <w:tcPr>
+            <w:tcW w:type="dxa" w:w="2880"/>
+          </w:tcPr>
+          <w:p>
+            <w:r>
+              <w:rPr>
+                <w:sz w:val="19"/>
+              </w:rPr>
+              <w:t>vertical_scale</w:t>
+            </w:r>
+          </w:p>
+        </w:tc>
+        <w:tc>
+          <w:tcPr>
+            <w:tcW w:type="dxa" w:w="2880"/>
+          </w:tcPr>
+          <w:p>
+            <w:r>
+              <w:rPr>
+                <w:sz w:val="19"/>
+              </w:rPr>
+              <w:t>number (V/div)</w:t>
+            </w:r>
+          </w:p>
+        </w:tc>
+        <w:tc>
+          <w:tcPr>
+            <w:tcW w:type="dxa" w:w="2880"/>
+          </w:tcPr>
+          <w:p>
+            <w:r>
+              <w:rPr>
+                <w:sz w:val="19"/>
+              </w:rPr>
+              <w:t>Volts per division, e.g. 5.0.</w:t>
+            </w:r>
+          </w:p>
+        </w:tc>
+      </w:tr>
+      <w:tr>
+        <w:tc>
+          <w:tcPr>
+            <w:tcW w:type="dxa" w:w="2880"/>
+          </w:tcPr>
+          <w:p>
+            <w:r>
+              <w:rPr>
+                <w:sz w:val="19"/>
+              </w:rPr>
+              <w:t>vertical_position</w:t>
+            </w:r>
+          </w:p>
+        </w:tc>
+        <w:tc>
+          <w:tcPr>
+            <w:tcW w:type="dxa" w:w="2880"/>
+          </w:tcPr>
+          <w:p>
+            <w:r>
+              <w:rPr>
+                <w:sz w:val="19"/>
+              </w:rPr>
+              <w:t>number (divisions)</w:t>
+            </w:r>
+          </w:p>
+        </w:tc>
+        <w:tc>
+          <w:tcPr>
+            <w:tcW w:type="dxa" w:w="2880"/>
+          </w:tcPr>
+          <w:p>
+            <w:r>
+              <w:rPr>
+                <w:sz w:val="19"/>
+              </w:rPr>
+              <w:t>Vertical position in divisions (Tektronix; Keysight uses offset instead).</w:t>
+            </w:r>
+          </w:p>
+        </w:tc>
+      </w:tr>
+      <w:tr>
+        <w:tc>
+          <w:tcPr>
+            <w:tcW w:type="dxa" w:w="2880"/>
+          </w:tcPr>
+          <w:p>
+            <w:r>
+              <w:rPr>
+                <w:sz w:val="19"/>
+              </w:rPr>
+              <w:t>offset</w:t>
+            </w:r>
+          </w:p>
+        </w:tc>
+        <w:tc>
+          <w:tcPr>
+            <w:tcW w:type="dxa" w:w="2880"/>
+          </w:tcPr>
+          <w:p>
+            <w:r>
+              <w:rPr>
+                <w:sz w:val="19"/>
+              </w:rPr>
+              <w:t>volts, or null</w:t>
+            </w:r>
+          </w:p>
+        </w:tc>
+        <w:tc>
+          <w:tcPr>
+            <w:tcW w:type="dxa" w:w="2880"/>
+          </w:tcPr>
+          <w:p>
+            <w:r>
+              <w:rPr>
+                <w:sz w:val="19"/>
+              </w:rPr>
+              <w:t>Vertical offset in volts.</w:t>
+            </w:r>
+          </w:p>
+        </w:tc>
+      </w:tr>
+      <w:tr>
+        <w:tc>
+          <w:tcPr>
+            <w:tcW w:type="dxa" w:w="2880"/>
+          </w:tcPr>
+          <w:p>
+            <w:r>
+              <w:rPr>
+                <w:sz w:val="19"/>
+              </w:rPr>
+              <w:t>termination</w:t>
+            </w:r>
+          </w:p>
+        </w:tc>
+        <w:tc>
+          <w:tcPr>
+            <w:tcW w:type="dxa" w:w="2880"/>
+          </w:tcPr>
+          <w:p>
+            <w:r>
+              <w:rPr>
+                <w:sz w:val="19"/>
+              </w:rPr>
+              <w:t>1000000 or 50</w:t>
+            </w:r>
+          </w:p>
+        </w:tc>
+        <w:tc>
+          <w:tcPr>
+            <w:tcW w:type="dxa" w:w="2880"/>
+          </w:tcPr>
+          <w:p>
+            <w:r>
+              <w:rPr>
+                <w:sz w:val="19"/>
+              </w:rPr>
+              <w:t>Input impedance in ohms: 1000000 = 1 MOhm, 50 = 50 Ohm.</w:t>
+            </w:r>
+          </w:p>
+        </w:tc>
+      </w:tr>
+      <w:tr>
+        <w:tc>
+          <w:tcPr>
+            <w:tcW w:type="dxa" w:w="2880"/>
+          </w:tcPr>
+          <w:p>
+            <w:r>
+              <w:rPr>
+                <w:sz w:val="19"/>
+              </w:rPr>
+              <w:t>bandwidth</w:t>
+            </w:r>
+          </w:p>
+        </w:tc>
+        <w:tc>
+          <w:tcPr>
+            <w:tcW w:type="dxa" w:w="2880"/>
+          </w:tcPr>
+          <w:p>
+            <w:r>
+              <w:rPr>
+                <w:sz w:val="19"/>
+              </w:rPr>
+              <w:t>number (Hz) or null</w:t>
+            </w:r>
+          </w:p>
+        </w:tc>
+        <w:tc>
+          <w:tcPr>
+            <w:tcW w:type="dxa" w:w="2880"/>
+          </w:tcPr>
+          <w:p>
+            <w:r>
+              <w:rPr>
+                <w:sz w:val="19"/>
+              </w:rPr>
+              <w:t>Input bandwidth limit (Tektronix), e.g. 500000000 for 500 MHz.</w:t>
+            </w:r>
+          </w:p>
+        </w:tc>
+      </w:tr>
+    </w:tbl>
+    <w:p/>
     <w:p>
       <w:pPr>
         <w:pStyle w:val="Heading2"/>
       </w:pPr>
       <w:r>
-        <w:t>5.3 Enum values (type them exactly)</w:t>
-      </w:r>
-    </w:p>
-    <w:p>
-      <w:pPr>
-        <w:pStyle w:val="ListBullet"/>
-      </w:pPr>
-      <w:r>
-        <w:t>trigger_source: "CH1" or "CH2"</w:t>
-      </w:r>
-    </w:p>
-    <w:p>
-      <w:pPr>
-        <w:pStyle w:val="ListBullet"/>
-      </w:pPr>
-      <w:r>
-        <w:t>trigger_type: "EDGE"</w:t>
-      </w:r>
-    </w:p>
-    <w:p>
-      <w:pPr>
-        <w:pStyle w:val="ListBullet"/>
-      </w:pPr>
-      <w:r>
-        <w:t>trigger_slope: "RISE" or "FALL"</w:t>
-      </w:r>
-    </w:p>
-    <w:p>
-      <w:pPr>
-        <w:pStyle w:val="ListBullet"/>
-      </w:pPr>
-      <w:r>
-        <w:t>trigger_mode: "NORMal" or "AUTO"</w:t>
-      </w:r>
-    </w:p>
-    <w:p>
-      <w:pPr>
-        <w:pStyle w:val="ListBullet"/>
-      </w:pPr>
-      <w:r>
-        <w:t>input_coupling: "DC" or "AC"</w:t>
-      </w:r>
-    </w:p>
-    <w:p>
-      <w:pPr>
-        <w:pStyle w:val="ListBullet"/>
-      </w:pPr>
-      <w:r>
-        <w:t>acquire_mode: "SAMple" - the default for these tests. Use "HIRes" only for a very slow or noisy capture where you want a cleaner (hardware-averaged) trace.</w:t>
-      </w:r>
-    </w:p>
-    <w:p>
-      <w:pPr>
-        <w:pStyle w:val="ListBullet"/>
-      </w:pPr>
-      <w:r>
-        <w:t>measurement: a note of what the test records - "rms", "delay", "pulse_width". This is metadata for your own reference; it does not change the scope.</w:t>
-      </w:r>
-    </w:p>
-    <w:p>
-      <w:pPr>
-        <w:pStyle w:val="Heading2"/>
-      </w:pPr>
-      <w:r>
-        <w:t>5.4 Things the tool works out for you</w:t>
-      </w:r>
-    </w:p>
-    <w:p>
-      <w:pPr>
-        <w:pStyle w:val="ListBullet"/>
-      </w:pPr>
-      <w:r>
-        <w:t>sample_rate - leave it null and it is DERIVED from record_length and horizontal_scale (sample_rate = record_length / (horizontal_scale x 10)). Set a number only if you want to force a specific rate.</w:t>
-      </w:r>
-    </w:p>
-    <w:p>
-      <w:pPr>
-        <w:pStyle w:val="ListBullet"/>
-      </w:pPr>
-      <w:r>
-        <w:t>trigger_level "half_battery" - resolved to battery_voltage / 2 when the config loads.</w:t>
-      </w:r>
-    </w:p>
-    <w:p>
-      <w:pPr>
-        <w:pStyle w:val="Heading2"/>
-      </w:pPr>
-      <w:r>
-        <w:t>5.5 Anatomy of a scope config</w:t>
+        <w:t>5.3 The capture window is NOT in the config - use duration_s</w:t>
+      </w:r>
+    </w:p>
+    <w:p>
+      <w:r>
+        <w:t>There is no horizontal_scale / s-per-division field. Set the capture window when you call configure_scope, with duration_s (total seconds across the screen):</w:t>
       </w:r>
     </w:p>
     <w:p>
@@ -2456,7 +3119,7 @@
         <w:spacing w:after="0" w:before="0"/>
       </w:pPr>
       <w:r>
-        <w:t>{</w:t>
+        <w:t>configure_scope("oscope1", "2", "1", duration_s=0.02)   # 0.02 s window</w:t>
       </w:r>
     </w:p>
     <w:p>
@@ -2465,7 +3128,53 @@
         <w:spacing w:after="0" w:before="0"/>
       </w:pPr>
       <w:r>
-        <w:t xml:space="preserve">  "name": "2",</w:t>
+        <w:t>#   the screen has 10 divisions, so s/div = duration_s / 10 = 0.002 (2 ms/div)</w:t>
+      </w:r>
+    </w:p>
+    <w:p/>
+    <w:p>
+      <w:r>
+        <w:t>Each shipped config's comment tells you the duration_s to pass for that test (WINDOW: ...). record_length stays the point count; the scope works out the sample rate to fit the window.</w:t>
+      </w:r>
+    </w:p>
+    <w:p>
+      <w:pPr>
+        <w:pStyle w:val="Heading2"/>
+      </w:pPr>
+      <w:r>
+        <w:t>5.4 Things the tool works out for you</w:t>
+      </w:r>
+    </w:p>
+    <w:p>
+      <w:pPr>
+        <w:pStyle w:val="ListBullet"/>
+      </w:pPr>
+      <w:r>
+        <w:t>The capture window - from duration_s at call time (above).</w:t>
+      </w:r>
+    </w:p>
+    <w:p>
+      <w:pPr>
+        <w:pStyle w:val="ListBullet"/>
+      </w:pPr>
+      <w:r>
+        <w:t>trigger_level "half_battery" - resolved to battery_voltage / 2 when the config loads.</w:t>
+      </w:r>
+    </w:p>
+    <w:p>
+      <w:pPr>
+        <w:pStyle w:val="ListBullet"/>
+      </w:pPr>
+      <w:r>
+        <w:t>sample_rate - leave it null; the scope derives the rate to fit the record into the window. Set a number only to force a specific rate (e.g. ecm_20min pins 10 S/s).</w:t>
+      </w:r>
+    </w:p>
+    <w:p>
+      <w:pPr>
+        <w:pStyle w:val="Heading2"/>
+      </w:pPr>
+      <w:r>
+        <w:t>5.5 Anatomy of a scope config</w:t>
       </w:r>
     </w:p>
     <w:p>
@@ -2474,7 +3183,7 @@
         <w:spacing w:after="0" w:before="0"/>
       </w:pPr>
       <w:r>
-        <w:t xml:space="preserve">  "record_length": 10000,       // points</w:t>
+        <w:t>{</w:t>
       </w:r>
     </w:p>
     <w:p>
@@ -2483,7 +3192,7 @@
         <w:spacing w:after="0" w:before="0"/>
       </w:pPr>
       <w:r>
-        <w:t xml:space="preserve">  "horizontal_scale": 0.002,    // seconds/div  (0.002 = 2 ms/div)</w:t>
+        <w:t xml:space="preserve">  "name": "2",</w:t>
       </w:r>
     </w:p>
     <w:p>
@@ -2492,7 +3201,7 @@
         <w:spacing w:after="0" w:before="0"/>
       </w:pPr>
       <w:r>
-        <w:t xml:space="preserve">  "trigger_position": 10,       // percent</w:t>
+        <w:t xml:space="preserve">  "record_length": 10000,       // points</w:t>
       </w:r>
     </w:p>
     <w:p>
@@ -2501,7 +3210,7 @@
         <w:spacing w:after="0" w:before="0"/>
       </w:pPr>
       <w:r>
-        <w:t xml:space="preserve">  "sample_rate": null,          // null -&gt; derived</w:t>
+        <w:t xml:space="preserve">  "trigger_position": 10,       // percent</w:t>
       </w:r>
     </w:p>
     <w:p>
@@ -2510,7 +3219,7 @@
         <w:spacing w:after="0" w:before="0"/>
       </w:pPr>
       <w:r>
-        <w:t xml:space="preserve">  "trigger_source": "CH1",</w:t>
+        <w:t xml:space="preserve">  "sample_rate": null,          // null -&gt; the scope works it out</w:t>
       </w:r>
     </w:p>
     <w:p>
@@ -2519,7 +3228,7 @@
         <w:spacing w:after="0" w:before="0"/>
       </w:pPr>
       <w:r>
-        <w:t xml:space="preserve">  "trigger_type": "EDGE",</w:t>
+        <w:t xml:space="preserve">  "trigger_source": "CH1",</w:t>
       </w:r>
     </w:p>
     <w:p>
@@ -2528,7 +3237,7 @@
         <w:spacing w:after="0" w:before="0"/>
       </w:pPr>
       <w:r>
-        <w:t xml:space="preserve">  "trigger_slope": "RISE",</w:t>
+        <w:t xml:space="preserve">  "trigger_type": "EDGE",</w:t>
       </w:r>
     </w:p>
     <w:p>
@@ -2537,7 +3246,7 @@
         <w:spacing w:after="0" w:before="0"/>
       </w:pPr>
       <w:r>
-        <w:t xml:space="preserve">  "trigger_level": "half_battery",</w:t>
+        <w:t xml:space="preserve">  "trigger_slope": "RISE",</w:t>
       </w:r>
     </w:p>
     <w:p>
@@ -2546,7 +3255,7 @@
         <w:spacing w:after="0" w:before="0"/>
       </w:pPr>
       <w:r>
-        <w:t xml:space="preserve">  "trigger_mode": "NORMal",</w:t>
+        <w:t xml:space="preserve">  "trigger_level": "half_battery",</w:t>
       </w:r>
     </w:p>
     <w:p>
@@ -2555,7 +3264,7 @@
         <w:spacing w:after="0" w:before="0"/>
       </w:pPr>
       <w:r>
-        <w:t xml:space="preserve">  "battery_voltage": 12,</w:t>
+        <w:t xml:space="preserve">  "trigger_mode": "NORMal",</w:t>
       </w:r>
     </w:p>
     <w:p>
@@ -2564,7 +3273,7 @@
         <w:spacing w:after="0" w:before="0"/>
       </w:pPr>
       <w:r>
-        <w:t xml:space="preserve">  "acquire_mode": "SAMple",</w:t>
+        <w:t xml:space="preserve">  "battery_voltage": 12,</w:t>
       </w:r>
     </w:p>
     <w:p>
@@ -2573,7 +3282,7 @@
         <w:spacing w:after="0" w:before="0"/>
       </w:pPr>
       <w:r>
-        <w:t xml:space="preserve">  "measurement": "rms",</w:t>
+        <w:t xml:space="preserve">  "acquire_mode": "SAMple",</w:t>
       </w:r>
     </w:p>
     <w:p>
@@ -2582,7 +3291,7 @@
         <w:spacing w:after="0" w:before="0"/>
       </w:pPr>
       <w:r>
-        <w:t xml:space="preserve">  "channels": {</w:t>
+        <w:t xml:space="preserve">  "measurement": "rms",</w:t>
       </w:r>
     </w:p>
     <w:p>
@@ -2591,7 +3300,7 @@
         <w:spacing w:after="0" w:before="0"/>
       </w:pPr>
       <w:r>
-        <w:t xml:space="preserve">    "1": { "input_coupling": "DC", "vertical_scale": 2.0, "vertical_position": -3.5,</w:t>
+        <w:t xml:space="preserve">  "channels": {</w:t>
       </w:r>
     </w:p>
     <w:p>
@@ -2600,7 +3309,7 @@
         <w:spacing w:after="0" w:before="0"/>
       </w:pPr>
       <w:r>
-        <w:t xml:space="preserve">           "offset": null, "termination": null, "bandwidth": null },</w:t>
+        <w:t xml:space="preserve">    "1": { "input_coupling": "DC", "vertical_scale": 2.0, "vertical_position": -3.5,</w:t>
       </w:r>
     </w:p>
     <w:p>
@@ -2609,7 +3318,7 @@
         <w:spacing w:after="0" w:before="0"/>
       </w:pPr>
       <w:r>
-        <w:t xml:space="preserve">    "2": { ... same fields, null if the channel is unused ... }</w:t>
+        <w:t xml:space="preserve">           "offset": null, "termination": null, "bandwidth": null },</w:t>
       </w:r>
     </w:p>
     <w:p>
@@ -2618,7 +3327,7 @@
         <w:spacing w:after="0" w:before="0"/>
       </w:pPr>
       <w:r>
-        <w:t xml:space="preserve">  }</w:t>
+        <w:t xml:space="preserve">    "2": { ... same fields, null if the channel is unused ... }</w:t>
       </w:r>
     </w:p>
     <w:p>
@@ -2627,77 +3336,7 @@
         <w:spacing w:after="0" w:before="0"/>
       </w:pPr>
       <w:r>
-        <w:t>}</w:t>
-      </w:r>
-    </w:p>
-    <w:p/>
-    <w:p>
-      <w:pPr>
-        <w:pStyle w:val="Heading2"/>
-      </w:pPr>
-      <w:r>
-        <w:t>5.6 Generator (AFG) config fields</w:t>
-      </w:r>
-    </w:p>
-    <w:p>
-      <w:r>
-        <w:t>Generator configs use their own field set (also plain numbers, native units):</w:t>
-      </w:r>
-    </w:p>
-    <w:p>
-      <w:pPr>
-        <w:pStyle w:val="ListBullet"/>
-      </w:pPr>
-      <w:r>
-        <w:t>shape - "SIN", "SQUare", "RAMP", "PULSe", "DC".</w:t>
-      </w:r>
-    </w:p>
-    <w:p>
-      <w:pPr>
-        <w:pStyle w:val="ListBullet"/>
-      </w:pPr>
-      <w:r>
-        <w:t>frequency (Hz), amplitude (Vpp), offset (volts).</w:t>
-      </w:r>
-    </w:p>
-    <w:p>
-      <w:pPr>
-        <w:pStyle w:val="ListBullet"/>
-      </w:pPr>
-      <w:r>
-        <w:t>duty_cycle (percent) - for a PULSe/SQUare it is the high-time duty; for a RAMP it is the rise symmetry (50 = triangle, 100/0 = sawtooth).</w:t>
-      </w:r>
-    </w:p>
-    <w:p>
-      <w:pPr>
-        <w:pStyle w:val="ListBullet"/>
-      </w:pPr>
-      <w:r>
-        <w:t>pulse_rate (seconds, the period), pulse_width (seconds), pulse_high_voltage (volts), pulse_low_voltage (volts) - an alternative to amplitude+offset for a pulse.</w:t>
-      </w:r>
-    </w:p>
-    <w:p>
-      <w:pPr>
-        <w:pStyle w:val="ListBullet"/>
-      </w:pPr>
-      <w:r>
-        <w:t>impedance - the output load: 50 or "INFinity" (high-Z). Set it to match the scope / ECM input so the amplitude reads back correctly.</w:t>
-      </w:r>
-    </w:p>
-    <w:p>
-      <w:pPr>
-        <w:pStyle w:val="ListBullet"/>
-      </w:pPr>
-      <w:r>
-        <w:t>Use EITHER amplitude+offset OR pulse_high_voltage+pulse_low_voltage, not both.</w:t>
-      </w:r>
-    </w:p>
-    <w:p>
-      <w:pPr>
-        <w:pStyle w:val="Heading2"/>
-      </w:pPr>
-      <w:r>
-        <w:t>5.7 Using a config in a sequence</w:t>
+        <w:t xml:space="preserve">  }</w:t>
       </w:r>
     </w:p>
     <w:p>
@@ -2706,7 +3345,552 @@
         <w:spacing w:after="0" w:before="0"/>
       </w:pPr>
       <w:r>
-        <w:t>configure_scope("oscope1", "2", "1")        apply scope config "2" to CH1</w:t>
+        <w:t>}</w:t>
+      </w:r>
+    </w:p>
+    <w:p>
+      <w:pPr>
+        <w:pStyle w:val="Mono"/>
+        <w:spacing w:after="0" w:before="0"/>
+      </w:pPr>
+      <w:r>
+        <w:t>// window is not here - pass duration_s to configure_scope (e.g. duration_s=0.02).</w:t>
+      </w:r>
+    </w:p>
+    <w:p/>
+    <w:p>
+      <w:pPr>
+        <w:pStyle w:val="Heading2"/>
+      </w:pPr>
+      <w:r>
+        <w:t>5.6 Generator (AFG) config fields</w:t>
+      </w:r>
+    </w:p>
+    <w:p>
+      <w:r>
+        <w:t>Generator configs use their own field set (also plain numbers, native units), under channels."1" (and default_channel). Use EITHER amplitude+offset OR pulse_high_voltage+pulse_low_voltage, not both.</w:t>
+      </w:r>
+    </w:p>
+    <w:tbl>
+      <w:tblPr>
+        <w:tblStyle w:val="TableGrid"/>
+        <w:tblW w:type="auto" w:w="0"/>
+        <w:tblLook w:firstColumn="1" w:firstRow="1" w:lastColumn="0" w:lastRow="0" w:noHBand="0" w:noVBand="1" w:val="04A0"/>
+      </w:tblPr>
+      <w:tblGrid>
+        <w:gridCol w:w="2880"/>
+        <w:gridCol w:w="2880"/>
+        <w:gridCol w:w="2880"/>
+      </w:tblGrid>
+      <w:tr>
+        <w:tc>
+          <w:tcPr>
+            <w:tcW w:type="dxa" w:w="2880"/>
+          </w:tcPr>
+          <w:p>
+            <w:r>
+              <w:rPr>
+                <w:b/>
+              </w:rPr>
+              <w:t>Field</w:t>
+            </w:r>
+          </w:p>
+        </w:tc>
+        <w:tc>
+          <w:tcPr>
+            <w:tcW w:type="dxa" w:w="2880"/>
+          </w:tcPr>
+          <w:p>
+            <w:r>
+              <w:rPr>
+                <w:b/>
+              </w:rPr>
+              <w:t>Expected value</w:t>
+            </w:r>
+          </w:p>
+        </w:tc>
+        <w:tc>
+          <w:tcPr>
+            <w:tcW w:type="dxa" w:w="2880"/>
+          </w:tcPr>
+          <w:p>
+            <w:r>
+              <w:rPr>
+                <w:b/>
+              </w:rPr>
+              <w:t>What it means</w:t>
+            </w:r>
+          </w:p>
+        </w:tc>
+      </w:tr>
+      <w:tr>
+        <w:tc>
+          <w:tcPr>
+            <w:tcW w:type="dxa" w:w="2880"/>
+          </w:tcPr>
+          <w:p>
+            <w:r>
+              <w:rPr>
+                <w:sz w:val="19"/>
+              </w:rPr>
+              <w:t>shape</w:t>
+            </w:r>
+          </w:p>
+        </w:tc>
+        <w:tc>
+          <w:tcPr>
+            <w:tcW w:type="dxa" w:w="2880"/>
+          </w:tcPr>
+          <w:p>
+            <w:r>
+              <w:rPr>
+                <w:sz w:val="19"/>
+              </w:rPr>
+              <w:t>"SIN"/"SQUare"/"RAMP"/"PULSe"/"DC"</w:t>
+            </w:r>
+          </w:p>
+        </w:tc>
+        <w:tc>
+          <w:tcPr>
+            <w:tcW w:type="dxa" w:w="2880"/>
+          </w:tcPr>
+          <w:p>
+            <w:r>
+              <w:rPr>
+                <w:sz w:val="19"/>
+              </w:rPr>
+              <w:t>Waveform shape.</w:t>
+            </w:r>
+          </w:p>
+        </w:tc>
+      </w:tr>
+      <w:tr>
+        <w:tc>
+          <w:tcPr>
+            <w:tcW w:type="dxa" w:w="2880"/>
+          </w:tcPr>
+          <w:p>
+            <w:r>
+              <w:rPr>
+                <w:sz w:val="19"/>
+              </w:rPr>
+              <w:t>frequency</w:t>
+            </w:r>
+          </w:p>
+        </w:tc>
+        <w:tc>
+          <w:tcPr>
+            <w:tcW w:type="dxa" w:w="2880"/>
+          </w:tcPr>
+          <w:p>
+            <w:r>
+              <w:rPr>
+                <w:sz w:val="19"/>
+              </w:rPr>
+              <w:t>number (Hz)</w:t>
+            </w:r>
+          </w:p>
+        </w:tc>
+        <w:tc>
+          <w:tcPr>
+            <w:tcW w:type="dxa" w:w="2880"/>
+          </w:tcPr>
+          <w:p>
+            <w:r>
+              <w:rPr>
+                <w:sz w:val="19"/>
+              </w:rPr>
+              <w:t>Frequency.</w:t>
+            </w:r>
+          </w:p>
+        </w:tc>
+      </w:tr>
+      <w:tr>
+        <w:tc>
+          <w:tcPr>
+            <w:tcW w:type="dxa" w:w="2880"/>
+          </w:tcPr>
+          <w:p>
+            <w:r>
+              <w:rPr>
+                <w:sz w:val="19"/>
+              </w:rPr>
+              <w:t>amplitude</w:t>
+            </w:r>
+          </w:p>
+        </w:tc>
+        <w:tc>
+          <w:tcPr>
+            <w:tcW w:type="dxa" w:w="2880"/>
+          </w:tcPr>
+          <w:p>
+            <w:r>
+              <w:rPr>
+                <w:sz w:val="19"/>
+              </w:rPr>
+              <w:t>number (Vpp)</w:t>
+            </w:r>
+          </w:p>
+        </w:tc>
+        <w:tc>
+          <w:tcPr>
+            <w:tcW w:type="dxa" w:w="2880"/>
+          </w:tcPr>
+          <w:p>
+            <w:r>
+              <w:rPr>
+                <w:sz w:val="19"/>
+              </w:rPr>
+              <w:t>Peak-to-peak amplitude.</w:t>
+            </w:r>
+          </w:p>
+        </w:tc>
+      </w:tr>
+      <w:tr>
+        <w:tc>
+          <w:tcPr>
+            <w:tcW w:type="dxa" w:w="2880"/>
+          </w:tcPr>
+          <w:p>
+            <w:r>
+              <w:rPr>
+                <w:sz w:val="19"/>
+              </w:rPr>
+              <w:t>offset</w:t>
+            </w:r>
+          </w:p>
+        </w:tc>
+        <w:tc>
+          <w:tcPr>
+            <w:tcW w:type="dxa" w:w="2880"/>
+          </w:tcPr>
+          <w:p>
+            <w:r>
+              <w:rPr>
+                <w:sz w:val="19"/>
+              </w:rPr>
+              <w:t>number (volts)</w:t>
+            </w:r>
+          </w:p>
+        </w:tc>
+        <w:tc>
+          <w:tcPr>
+            <w:tcW w:type="dxa" w:w="2880"/>
+          </w:tcPr>
+          <w:p>
+            <w:r>
+              <w:rPr>
+                <w:sz w:val="19"/>
+              </w:rPr>
+              <w:t>DC offset.</w:t>
+            </w:r>
+          </w:p>
+        </w:tc>
+      </w:tr>
+      <w:tr>
+        <w:tc>
+          <w:tcPr>
+            <w:tcW w:type="dxa" w:w="2880"/>
+          </w:tcPr>
+          <w:p>
+            <w:r>
+              <w:rPr>
+                <w:sz w:val="19"/>
+              </w:rPr>
+              <w:t>duty_cycle</w:t>
+            </w:r>
+          </w:p>
+        </w:tc>
+        <w:tc>
+          <w:tcPr>
+            <w:tcW w:type="dxa" w:w="2880"/>
+          </w:tcPr>
+          <w:p>
+            <w:r>
+              <w:rPr>
+                <w:sz w:val="19"/>
+              </w:rPr>
+              <w:t>number (percent)</w:t>
+            </w:r>
+          </w:p>
+        </w:tc>
+        <w:tc>
+          <w:tcPr>
+            <w:tcW w:type="dxa" w:w="2880"/>
+          </w:tcPr>
+          <w:p>
+            <w:r>
+              <w:rPr>
+                <w:sz w:val="19"/>
+              </w:rPr>
+              <w:t>For PULSe/SQUare, the high-time duty; for RAMP, the rise symmetry (50 = triangle, 100/0 = sawtooth).</w:t>
+            </w:r>
+          </w:p>
+        </w:tc>
+      </w:tr>
+      <w:tr>
+        <w:tc>
+          <w:tcPr>
+            <w:tcW w:type="dxa" w:w="2880"/>
+          </w:tcPr>
+          <w:p>
+            <w:r>
+              <w:rPr>
+                <w:sz w:val="19"/>
+              </w:rPr>
+              <w:t>phase</w:t>
+            </w:r>
+          </w:p>
+        </w:tc>
+        <w:tc>
+          <w:tcPr>
+            <w:tcW w:type="dxa" w:w="2880"/>
+          </w:tcPr>
+          <w:p>
+            <w:r>
+              <w:rPr>
+                <w:sz w:val="19"/>
+              </w:rPr>
+              <w:t>number (deg) or null</w:t>
+            </w:r>
+          </w:p>
+        </w:tc>
+        <w:tc>
+          <w:tcPr>
+            <w:tcW w:type="dxa" w:w="2880"/>
+          </w:tcPr>
+          <w:p>
+            <w:r>
+              <w:rPr>
+                <w:sz w:val="19"/>
+              </w:rPr>
+              <w:t>Phase.</w:t>
+            </w:r>
+          </w:p>
+        </w:tc>
+      </w:tr>
+      <w:tr>
+        <w:tc>
+          <w:tcPr>
+            <w:tcW w:type="dxa" w:w="2880"/>
+          </w:tcPr>
+          <w:p>
+            <w:r>
+              <w:rPr>
+                <w:sz w:val="19"/>
+              </w:rPr>
+              <w:t>impedance</w:t>
+            </w:r>
+          </w:p>
+        </w:tc>
+        <w:tc>
+          <w:tcPr>
+            <w:tcW w:type="dxa" w:w="2880"/>
+          </w:tcPr>
+          <w:p>
+            <w:r>
+              <w:rPr>
+                <w:sz w:val="19"/>
+              </w:rPr>
+              <w:t>50 or "INFinity"</w:t>
+            </w:r>
+          </w:p>
+        </w:tc>
+        <w:tc>
+          <w:tcPr>
+            <w:tcW w:type="dxa" w:w="2880"/>
+          </w:tcPr>
+          <w:p>
+            <w:r>
+              <w:rPr>
+                <w:sz w:val="19"/>
+              </w:rPr>
+              <w:t>Output load. Match the scope / ECM input (high-Z = INFinity) so the amplitude reads back correctly.</w:t>
+            </w:r>
+          </w:p>
+        </w:tc>
+      </w:tr>
+      <w:tr>
+        <w:tc>
+          <w:tcPr>
+            <w:tcW w:type="dxa" w:w="2880"/>
+          </w:tcPr>
+          <w:p>
+            <w:r>
+              <w:rPr>
+                <w:sz w:val="19"/>
+              </w:rPr>
+              <w:t>pulse_rate</w:t>
+            </w:r>
+          </w:p>
+        </w:tc>
+        <w:tc>
+          <w:tcPr>
+            <w:tcW w:type="dxa" w:w="2880"/>
+          </w:tcPr>
+          <w:p>
+            <w:r>
+              <w:rPr>
+                <w:sz w:val="19"/>
+              </w:rPr>
+              <w:t>number (seconds)</w:t>
+            </w:r>
+          </w:p>
+        </w:tc>
+        <w:tc>
+          <w:tcPr>
+            <w:tcW w:type="dxa" w:w="2880"/>
+          </w:tcPr>
+          <w:p>
+            <w:r>
+              <w:rPr>
+                <w:sz w:val="19"/>
+              </w:rPr>
+              <w:t>Pulse period (pulse-by-levels alternative to amplitude/offset).</w:t>
+            </w:r>
+          </w:p>
+        </w:tc>
+      </w:tr>
+      <w:tr>
+        <w:tc>
+          <w:tcPr>
+            <w:tcW w:type="dxa" w:w="2880"/>
+          </w:tcPr>
+          <w:p>
+            <w:r>
+              <w:rPr>
+                <w:sz w:val="19"/>
+              </w:rPr>
+              <w:t>pulse_width</w:t>
+            </w:r>
+          </w:p>
+        </w:tc>
+        <w:tc>
+          <w:tcPr>
+            <w:tcW w:type="dxa" w:w="2880"/>
+          </w:tcPr>
+          <w:p>
+            <w:r>
+              <w:rPr>
+                <w:sz w:val="19"/>
+              </w:rPr>
+              <w:t>number (seconds)</w:t>
+            </w:r>
+          </w:p>
+        </w:tc>
+        <w:tc>
+          <w:tcPr>
+            <w:tcW w:type="dxa" w:w="2880"/>
+          </w:tcPr>
+          <w:p>
+            <w:r>
+              <w:rPr>
+                <w:sz w:val="19"/>
+              </w:rPr>
+              <w:t>Pulse high-time width.</w:t>
+            </w:r>
+          </w:p>
+        </w:tc>
+      </w:tr>
+      <w:tr>
+        <w:tc>
+          <w:tcPr>
+            <w:tcW w:type="dxa" w:w="2880"/>
+          </w:tcPr>
+          <w:p>
+            <w:r>
+              <w:rPr>
+                <w:sz w:val="19"/>
+              </w:rPr>
+              <w:t>pulse_high_voltage</w:t>
+            </w:r>
+          </w:p>
+        </w:tc>
+        <w:tc>
+          <w:tcPr>
+            <w:tcW w:type="dxa" w:w="2880"/>
+          </w:tcPr>
+          <w:p>
+            <w:r>
+              <w:rPr>
+                <w:sz w:val="19"/>
+              </w:rPr>
+              <w:t>number (volts)</w:t>
+            </w:r>
+          </w:p>
+        </w:tc>
+        <w:tc>
+          <w:tcPr>
+            <w:tcW w:type="dxa" w:w="2880"/>
+          </w:tcPr>
+          <w:p>
+            <w:r>
+              <w:rPr>
+                <w:sz w:val="19"/>
+              </w:rPr>
+              <w:t>Pulse high level.</w:t>
+            </w:r>
+          </w:p>
+        </w:tc>
+      </w:tr>
+      <w:tr>
+        <w:tc>
+          <w:tcPr>
+            <w:tcW w:type="dxa" w:w="2880"/>
+          </w:tcPr>
+          <w:p>
+            <w:r>
+              <w:rPr>
+                <w:sz w:val="19"/>
+              </w:rPr>
+              <w:t>pulse_low_voltage</w:t>
+            </w:r>
+          </w:p>
+        </w:tc>
+        <w:tc>
+          <w:tcPr>
+            <w:tcW w:type="dxa" w:w="2880"/>
+          </w:tcPr>
+          <w:p>
+            <w:r>
+              <w:rPr>
+                <w:sz w:val="19"/>
+              </w:rPr>
+              <w:t>number (volts)</w:t>
+            </w:r>
+          </w:p>
+        </w:tc>
+        <w:tc>
+          <w:tcPr>
+            <w:tcW w:type="dxa" w:w="2880"/>
+          </w:tcPr>
+          <w:p>
+            <w:r>
+              <w:rPr>
+                <w:sz w:val="19"/>
+              </w:rPr>
+              <w:t>Pulse low level.</w:t>
+            </w:r>
+          </w:p>
+        </w:tc>
+      </w:tr>
+    </w:tbl>
+    <w:p/>
+    <w:p>
+      <w:pPr>
+        <w:pStyle w:val="Heading2"/>
+      </w:pPr>
+      <w:r>
+        <w:t>5.7 Using a config in a sequence</w:t>
+      </w:r>
+    </w:p>
+    <w:p>
+      <w:pPr>
+        <w:pStyle w:val="Mono"/>
+        <w:spacing w:after="0" w:before="0"/>
+      </w:pPr>
+      <w:r>
+        <w:t>configure_scope("oscope1", "2", "1", duration_s=0.02)   apply config "2", 0.02 s window</w:t>
       </w:r>
     </w:p>
     <w:p>

</xml_diff>